<commit_message>
datasheets and 1 tecnichka
</commit_message>
<xml_diff>
--- a/docs/Короткие_инструкции/docx/A1_5_Настройка_OLED_дисплея.docx
+++ b/docs/Короткие_инструкции/docx/A1_5_Настройка_OLED_дисплея.docx
@@ -87,7 +87,30 @@
           <w:rFonts w:hint="default"/>
           <w:lang w:val="ru-RU"/>
         </w:rPr>
-        <w:t xml:space="preserve"> Установить и настроить сервис, который будет автоматически выводить на OLED-дисплей робота полезную информацию: IP-адрес, пароль для подключения, состояние батареи (ток, напряжение, заряд).</w:t>
+        <w:t xml:space="preserve"> Установить и настроить сервис, который будет автоматически выводить на OLED-дисплей робота полезную информацию: IP-адрес, пароль для подключения, состояние батареи (ток</w:t>
+      </w:r>
+      <w:r>
+        <w:rPr>
+          <w:rFonts w:hint="default"/>
+          <w:lang w:val="en-US"/>
+        </w:rPr>
+        <w:t xml:space="preserve"> </w:t>
+      </w:r>
+      <w:r>
+        <w:rPr>
+          <w:rFonts w:hint="default"/>
+          <w:lang w:val="ru-RU"/>
+        </w:rPr>
+        <w:t>на зарядке</w:t>
+      </w:r>
+      <w:bookmarkStart w:id="1" w:name="_GoBack"/>
+      <w:bookmarkEnd w:id="1"/>
+      <w:r>
+        <w:rPr>
+          <w:rFonts w:hint="default"/>
+          <w:lang w:val="ru-RU"/>
+        </w:rPr>
+        <w:t>, напряжение, заряд).</w:t>
       </w:r>
     </w:p>
     <w:p>
@@ -885,8 +908,6 @@
         </w:rPr>
         <w:t>.</w:t>
       </w:r>
-      <w:bookmarkStart w:id="1" w:name="_GoBack"/>
-      <w:bookmarkEnd w:id="1"/>
     </w:p>
     <w:p>
       <w:pPr>

</xml_diff>

<commit_message>
Some cosmetic changes in short instructions
</commit_message>
<xml_diff>
--- a/docs/Короткие_инструкции/docx/A1_5_Настройка_OLED_дисплея.docx
+++ b/docs/Короткие_инструкции/docx/A1_5_Настройка_OLED_дисплея.docx
@@ -101,16 +101,7 @@
           <w:rFonts w:hint="default"/>
           <w:lang w:val="ru-RU"/>
         </w:rPr>
-        <w:t>на зарядке</w:t>
-      </w:r>
-      <w:bookmarkStart w:id="1" w:name="_GoBack"/>
-      <w:bookmarkEnd w:id="1"/>
-      <w:r>
-        <w:rPr>
-          <w:rFonts w:hint="default"/>
-          <w:lang w:val="ru-RU"/>
-        </w:rPr>
-        <w:t>, напряжение, заряд).</w:t>
+        <w:t>на зарядке, напряжение, заряд).</w:t>
       </w:r>
     </w:p>
     <w:p>
@@ -333,7 +324,21 @@
           <w:rFonts w:hint="default"/>
           <w:lang w:val="ru-RU"/>
         </w:rPr>
-        <w:t>(если у вы устанавливали репозиторий по другому адрессу, то замените на релевантный)</w:t>
+        <w:t xml:space="preserve">(если у вы устанавливали репозиторий по другому </w:t>
+      </w:r>
+      <w:r>
+        <w:rPr>
+          <w:rFonts w:hint="default"/>
+          <w:lang w:val="en-US"/>
+        </w:rPr>
+        <w:t>адресу</w:t>
+      </w:r>
+      <w:r>
+        <w:rPr>
+          <w:rFonts w:hint="default"/>
+          <w:lang w:val="ru-RU"/>
+        </w:rPr>
+        <w:t>, то замените на релевантный)</w:t>
       </w:r>
     </w:p>
     <w:p>
@@ -1042,6 +1047,70 @@
         </w:rPr>
         <w:t>-коды со ссылками на их аккаунты представлены ниже.</w:t>
       </w:r>
+    </w:p>
+    <w:p>
+      <w:pPr>
+        <w:rPr>
+          <w:rFonts w:hint="default"/>
+          <w:lang w:val="ru-RU"/>
+        </w:rPr>
+      </w:pPr>
+    </w:p>
+    <w:p>
+      <w:pPr>
+        <w:rPr>
+          <w:rFonts w:hint="default"/>
+          <w:lang w:val="ru-RU"/>
+        </w:rPr>
+      </w:pPr>
+    </w:p>
+    <w:p>
+      <w:pPr>
+        <w:rPr>
+          <w:rFonts w:hint="default"/>
+          <w:lang w:val="ru-RU"/>
+        </w:rPr>
+      </w:pPr>
+    </w:p>
+    <w:p>
+      <w:pPr>
+        <w:rPr>
+          <w:rFonts w:hint="default"/>
+          <w:lang w:val="ru-RU"/>
+        </w:rPr>
+      </w:pPr>
+    </w:p>
+    <w:p>
+      <w:pPr>
+        <w:rPr>
+          <w:rFonts w:hint="default"/>
+          <w:lang w:val="ru-RU"/>
+        </w:rPr>
+      </w:pPr>
+    </w:p>
+    <w:p>
+      <w:pPr>
+        <w:rPr>
+          <w:rFonts w:hint="default"/>
+          <w:lang w:val="ru-RU"/>
+        </w:rPr>
+      </w:pPr>
+    </w:p>
+    <w:p>
+      <w:pPr>
+        <w:rPr>
+          <w:rFonts w:hint="default"/>
+          <w:lang w:val="ru-RU"/>
+        </w:rPr>
+      </w:pPr>
+    </w:p>
+    <w:p>
+      <w:pPr>
+        <w:rPr>
+          <w:rFonts w:hint="default"/>
+          <w:lang w:val="ru-RU"/>
+        </w:rPr>
+      </w:pPr>
     </w:p>
     <w:p>
       <w:pPr>
@@ -1073,8 +1142,8 @@
         </w:tblCellMar>
       </w:tblPr>
       <w:tblGrid>
-        <w:gridCol w:w="4296"/>
-        <w:gridCol w:w="4226"/>
+        <w:gridCol w:w="4344"/>
+        <w:gridCol w:w="4178"/>
       </w:tblGrid>
       <w:tr>
         <w:tblPrEx>
@@ -1205,11 +1274,12 @@
                 <w:lang w:val="ru-RU"/>
               </w:rPr>
             </w:pPr>
+            <w:bookmarkStart w:id="1" w:name="_GoBack"/>
             <w:r>
               <w:drawing>
                 <wp:inline distT="0" distB="0" distL="114300" distR="114300">
-                  <wp:extent cx="2576195" cy="2981325"/>
-                  <wp:effectExtent l="0" t="0" r="14605" b="5715"/>
+                  <wp:extent cx="2651760" cy="3068955"/>
+                  <wp:effectExtent l="0" t="0" r="0" b="9525"/>
                   <wp:docPr id="1" name="Изображение 1"/>
                   <wp:cNvGraphicFramePr>
                     <a:graphicFrameLocks xmlns:a="http://schemas.openxmlformats.org/drawingml/2006/main" noChangeAspect="1"/>
@@ -1232,7 +1302,7 @@
                         <pic:spPr>
                           <a:xfrm>
                             <a:off x="0" y="0"/>
-                            <a:ext cx="2576195" cy="2981325"/>
+                            <a:ext cx="2651760" cy="3068955"/>
                           </a:xfrm>
                           <a:prstGeom prst="rect">
                             <a:avLst/>
@@ -1248,6 +1318,7 @@
                 </wp:inline>
               </w:drawing>
             </w:r>
+            <w:bookmarkEnd w:id="1"/>
           </w:p>
         </w:tc>
         <w:tc>
@@ -1456,7 +1527,7 @@
         </mc:Choice>
         <mc:Fallback>
           <w:pict>
-            <v:shape id="_x0000_s1026" o:spid="_x0000_s1026" o:spt="202" type="#_x0000_t202" style="position:absolute;left:0pt;margin-top:0pt;height:144pt;width:144pt;mso-position-horizontal:center;mso-position-horizontal-relative:margin;mso-wrap-style:none;z-index:251659264;mso-width-relative:page;mso-height-relative:page;" filled="f" stroked="f" coordsize="21600,21600" o:gfxdata="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">
+            <v:shape id="_x0000_s1026" o:spid="_x0000_s1026" o:spt="202" type="#_x0000_t202" style="position:absolute;left:0pt;margin-top:0pt;height:144pt;width:144pt;mso-position-horizontal:center;mso-position-horizontal-relative:margin;mso-wrap-style:none;z-index:251659264;mso-width-relative:page;mso-height-relative:page;" filled="f" stroked="f" coordsize="21600,21600" o:gfxdata="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">
               <v:fill on="f" focussize="0,0"/>
               <v:stroke on="f" weight="0.5pt"/>
               <v:imagedata o:title=""/>
@@ -2537,9 +2608,7 @@
 
 <file path=customXml/item1.xml><?xml version="1.0" encoding="utf-8"?>
 <s:customData xmlns="http://www.wps.cn/officeDocument/2013/wpsCustomData" xmlns:s="http://www.wps.cn/officeDocument/2013/wpsCustomData">
-  <customSectProps>
-    <customSectPr/>
-  </customSectProps>
+  <customSectProps/>
   <customShpExts>
     <customShpInfo spid="_x0000_s1026" textRotate="1"/>
   </customShpExts>

</xml_diff>